<commit_message>
Correct finch-example attribution and descriptive-methods summary
Attribute the drought/beak-size narrative to the textbook rather than the
lecture slides, and list all four slide-taught descriptive research types
in the learning-objective summary; regenerate affected Word/PDF files.

Co-Authored-By: Claude Fable 5 <noreply@anthropic.com>
Claude-Session: https://claude.ai/code/session_01AkchhwDyNx7DHsLu8RARDU
</commit_message>
<xml_diff>
--- a/assignments/psych-chapter1/01_People_to_Know_Chapter1_COMPLETED.docx
+++ b/assignments/psych-chapter1/01_People_to_Know_Chapter1_COMPLETED.docx
@@ -2432,20 +2432,20 @@
         <w:t xml:space="preserve"> </w:t>
       </w:r>
       <w:r>
-        <w:t xml:space="preserve">Darwin observed great variability in the characteristics of humans and other organisms and argued that these traits were shaped by natural selection. The lecture slides use the</w:t>
-      </w:r>
-      <w:r>
-        <w:t xml:space="preserve"> </w:t>
-      </w:r>
-      <w:r>
-        <w:rPr>
-          <w:bCs/>
-          <w:b/>
-        </w:rPr>
-        <w:t xml:space="preserve">finch beak example</w:t>
-      </w:r>
-      <w:r>
-        <w:t xml:space="preserve">: in a drought, when only big tough seeds remain, big-beaked finches are more likely to survive and reproduce — so more big-beaked birds appear in the next generation.</w:t>
+        <w:t xml:space="preserve">Darwin observed great variability in the characteristics of humans and other organisms and argued that these traits were shaped by natural selection. The lecture slides cite the</w:t>
+      </w:r>
+      <w:r>
+        <w:t xml:space="preserve"> </w:t>
+      </w:r>
+      <w:r>
+        <w:rPr>
+          <w:bCs/>
+          <w:b/>
+        </w:rPr>
+        <w:t xml:space="preserve">birds-and-beak-size example</w:t>
+      </w:r>
+      <w:r>
+        <w:t xml:space="preserve">, and the textbook fills in the story: in a drought, when only big tough seeds remain, big-beaked finches are more likely to survive and reproduce — so more big-beaked birds appear in the next generation. As the textbook puts it,</w:t>
       </w:r>
       <w:r>
         <w:t xml:space="preserve"> </w:t>
@@ -2454,7 +2454,7 @@
         <w:t xml:space="preserve">“</w:t>
       </w:r>
       <w:r>
-        <w:t xml:space="preserve">Natural selection right before your eyes.</w:t>
+        <w:t xml:space="preserve">It’s natural selection right before your eyes.</w:t>
       </w:r>
       <w:r>
         <w:t xml:space="preserve">”</w:t>

</xml_diff>

<commit_message>
Apply remaining verification fixes and finalize package notes
Align Skinner, Clark, and lie-detector study wording with the textbook,
and clarify which file formats to upload to NotebookLM; regenerate the
affected Word and PDF files.

Co-Authored-By: Claude Fable 5 <noreply@anthropic.com>
Claude-Session: https://claude.ai/code/session_01AkchhwDyNx7DHsLu8RARDU
</commit_message>
<xml_diff>
--- a/assignments/psych-chapter1/01_People_to_Know_Chapter1_COMPLETED.docx
+++ b/assignments/psych-chapter1/01_People_to_Know_Chapter1_COMPLETED.docx
@@ -3179,7 +3179,7 @@
         <w:t xml:space="preserve"> </w:t>
       </w:r>
       <w:r>
-        <w:t xml:space="preserve">goal of psychology operating at the level of the Supreme Court. Despite her credentials, the discrimination she studied also shaped her own career: her husband held a faculty position at City College of New York, but</w:t>
+        <w:t xml:space="preserve">goal of psychology operating at the level of the Supreme Court. Despite her credentials, the discrimination she studied also shaped her own career: her husband held a faculty position at City University of New York (the textbook’s wording; historically he taught at its City College campus), but</w:t>
       </w:r>
       <w:r>
         <w:t xml:space="preserve"> </w:t>
@@ -4193,7 +4193,7 @@
           <w:bCs/>
           <w:b/>
         </w:rPr>
-        <w:t xml:space="preserve">acknowledged that mental processes such as memory and emotion exist</w:t>
+        <w:t xml:space="preserve">acknowledged that mental processes such as memory and emotion might exist</w:t>
       </w:r>
       <w:r>
         <w:t xml:space="preserve"> </w:t>
@@ -4209,10 +4209,10 @@
           <w:bCs/>
           <w:b/>
         </w:rPr>
-        <w:t xml:space="preserve">not topics that can be studied scientifically</w:t>
-      </w:r>
-      <w:r>
-        <w:t xml:space="preserve">, because they can’t be observed and documented. His signature idea, operant conditioning, is learning driven by consequences: people (and animals)</w:t>
+        <w:t xml:space="preserve">not topics to be studied in psychology</w:t>
+      </w:r>
+      <w:r>
+        <w:t xml:space="preserve">, because they can’t be observed and documented; to ensure psychology was a science, he studied only observable behavior. His signature idea, operant conditioning, is learning driven by consequences: people (and animals)</w:t>
       </w:r>
       <w:r>
         <w:t xml:space="preserve"> </w:t>

</xml_diff>